<commit_message>
Fixed the big O notation
</commit_message>
<xml_diff>
--- a/hw4.docx
+++ b/hw4.docx
@@ -251,15 +251,7 @@
         </m:r>
       </m:oMath>
       <w:r>
-        <w:t xml:space="preserve"> since the gradient does not </w:t>
-      </w:r>
-      <w:proofErr w:type="gramStart"/>
-      <w:r>
-        <w:t>depends</w:t>
-      </w:r>
-      <w:proofErr w:type="gramEnd"/>
-      <w:r>
-        <w:t xml:space="preserve"> on it.</w:t>
+        <w:t xml:space="preserve"> since the gradient does not depends on it.</w:t>
       </w:r>
       <w:r>
         <w:br/>
@@ -307,35 +299,13 @@
         </w:numPr>
       </w:pPr>
       <w:r>
-        <w:t xml:space="preserve">You have built a network using the tanh activation for all the hidden units. You initialize the weights to </w:t>
-      </w:r>
-      <w:proofErr w:type="gramStart"/>
-      <w:r>
-        <w:t>relative</w:t>
-      </w:r>
-      <w:proofErr w:type="gramEnd"/>
-      <w:r>
-        <w:t xml:space="preserve"> large values, using </w:t>
+        <w:t xml:space="preserve">You have built a network using the tanh activation for all the hidden units. You initialize the weights to relative large values, using </w:t>
       </w:r>
       <w:r>
         <w:rPr>
           <w:rStyle w:val="VerbatimChar"/>
         </w:rPr>
-        <w:t>randn</w:t>
-      </w:r>
-      <w:proofErr w:type="gramStart"/>
-      <w:r>
-        <w:rPr>
-          <w:rStyle w:val="VerbatimChar"/>
-        </w:rPr>
-        <w:t>(..,..</w:t>
-      </w:r>
-      <w:proofErr w:type="gramEnd"/>
-      <w:r>
-        <w:rPr>
-          <w:rStyle w:val="VerbatimChar"/>
-        </w:rPr>
-        <w:t>)*1000</w:t>
+        <w:t>randn(..,..)*1000</w:t>
       </w:r>
       <w:r>
         <w:t>. What will happen?</w:t>
@@ -1516,21 +1486,12 @@
         </w:rPr>
         <w:t xml:space="preserve"> </w:t>
       </w:r>
-      <w:proofErr w:type="spellStart"/>
       <w:r>
         <w:rPr>
           <w:rStyle w:val="VerbatimChar"/>
           <w:color w:val="153D63" w:themeColor="text2" w:themeTint="E6"/>
         </w:rPr>
-        <w:t>weight_decay</w:t>
-      </w:r>
-      <w:proofErr w:type="spellEnd"/>
-      <w:r>
-        <w:rPr>
-          <w:rStyle w:val="VerbatimChar"/>
-          <w:color w:val="153D63" w:themeColor="text2" w:themeTint="E6"/>
-        </w:rPr>
-        <w:t xml:space="preserve"> – </w:t>
+        <w:t xml:space="preserve">weight_decay – </w:t>
       </w:r>
       <w:r>
         <w:rPr>
@@ -1599,15 +1560,7 @@
         </m:r>
       </m:oMath>
       <w:r>
-        <w:t xml:space="preserve">-grams language models? (limit your answer to less </w:t>
-      </w:r>
-      <w:proofErr w:type="spellStart"/>
-      <w:r>
-        <w:t>then</w:t>
-      </w:r>
-      <w:proofErr w:type="spellEnd"/>
-      <w:r>
-        <w:t xml:space="preserve"> 5 sentences).</w:t>
+        <w:t>-grams language models? (limit your answer to less then 5 sentences).</w:t>
       </w:r>
     </w:p>
     <w:p>
@@ -1699,19 +1652,43 @@
         <w:rPr>
           <w:color w:val="153D63" w:themeColor="text2" w:themeTint="E6"/>
         </w:rPr>
-        <w:t>n the smallest</w:t>
-      </w:r>
-      <w:r>
-        <w:rPr>
-          <w:color w:val="153D63" w:themeColor="text2" w:themeTint="E6"/>
-        </w:rPr>
-        <w:t xml:space="preserve"> n,</w:t>
-      </w:r>
-      <w:r>
-        <w:rPr>
-          <w:color w:val="153D63" w:themeColor="text2" w:themeTint="E6"/>
-        </w:rPr>
-        <w:t xml:space="preserve"> the embeddings</w:t>
+        <w:t xml:space="preserve">n </w:t>
+      </w:r>
+      <w:r>
+        <w:rPr>
+          <w:color w:val="153D63" w:themeColor="text2" w:themeTint="E6"/>
+        </w:rPr>
+        <w:t>n-grams with smaller</w:t>
+      </w:r>
+      <w:r>
+        <w:rPr>
+          <w:color w:val="153D63" w:themeColor="text2" w:themeTint="E6"/>
+        </w:rPr>
+        <w:t xml:space="preserve"> n</w:t>
+      </w:r>
+      <w:r>
+        <w:rPr>
+          <w:color w:val="153D63" w:themeColor="text2" w:themeTint="E6"/>
+        </w:rPr>
+        <w:t>,</w:t>
+      </w:r>
+      <w:r>
+        <w:rPr>
+          <w:color w:val="153D63" w:themeColor="text2" w:themeTint="E6"/>
+        </w:rPr>
+        <w:t xml:space="preserve"> the </w:t>
+      </w:r>
+      <w:r>
+        <w:rPr>
+          <w:color w:val="153D63" w:themeColor="text2" w:themeTint="E6"/>
+        </w:rPr>
+        <w:t xml:space="preserve">fixed-window </w:t>
+      </w:r>
+      <w:r>
+        <w:rPr>
+          <w:color w:val="153D63" w:themeColor="text2" w:themeTint="E6"/>
+        </w:rPr>
+        <w:t>embeddings</w:t>
       </w:r>
       <w:r>
         <w:rPr>
@@ -1795,13 +1772,56 @@
         <w:rPr>
           <w:color w:val="153D63" w:themeColor="text2" w:themeTint="E6"/>
         </w:rPr>
-        <w:t>(exp(n))</w:t>
-      </w:r>
-      <w:r>
-        <w:rPr>
-          <w:color w:val="153D63" w:themeColor="text2" w:themeTint="E6"/>
-        </w:rPr>
-        <w:t xml:space="preserve"> vs. O(n) for fixed window</w:t>
+        <w:t>(</w:t>
+      </w:r>
+      <w:r>
+        <w:rPr>
+          <w:color w:val="153D63" w:themeColor="text2" w:themeTint="E6"/>
+        </w:rPr>
+        <w:t>V</w:t>
+      </w:r>
+      <w:r>
+        <w:rPr>
+          <w:color w:val="153D63" w:themeColor="text2" w:themeTint="E6"/>
+          <w:vertAlign w:val="superscript"/>
+        </w:rPr>
+        <w:t>n</w:t>
+      </w:r>
+      <w:r>
+        <w:rPr>
+          <w:color w:val="153D63" w:themeColor="text2" w:themeTint="E6"/>
+        </w:rPr>
+        <w:t>)</w:t>
+      </w:r>
+      <w:r>
+        <w:rPr>
+          <w:color w:val="153D63" w:themeColor="text2" w:themeTint="E6"/>
+        </w:rPr>
+        <w:t xml:space="preserve"> vs. O(</w:t>
+      </w:r>
+      <w:r>
+        <w:rPr>
+          <w:color w:val="153D63" w:themeColor="text2" w:themeTint="E6"/>
+        </w:rPr>
+        <w:t>V</w:t>
+      </w:r>
+      <w:r>
+        <w:rPr>
+          <w:color w:val="153D63" w:themeColor="text2" w:themeTint="E6"/>
+        </w:rPr>
+        <w:t>)</w:t>
+      </w:r>
+      <w:r>
+        <w:rPr>
+          <w:color w:val="153D63" w:themeColor="text2" w:themeTint="E6"/>
+        </w:rPr>
+        <w:t>(V is vocabulary size)</w:t>
+      </w:r>
+      <w:r>
+        <w:rPr>
+          <w:color w:val="153D63" w:themeColor="text2" w:themeTint="E6"/>
+        </w:rPr>
+        <w:t xml:space="preserve"> for fixed window</w:t>
       </w:r>
       <w:r>
         <w:rPr>
@@ -4501,21 +4521,12 @@
         </w:rPr>
         <w:t xml:space="preserve">is non-zero when </w:t>
       </w:r>
-      <w:proofErr w:type="spellStart"/>
       <w:r>
         <w:rPr>
           <w:rFonts w:eastAsiaTheme="minorEastAsia"/>
           <w:color w:val="153D63" w:themeColor="text2" w:themeTint="E6"/>
         </w:rPr>
-        <w:t>i</w:t>
-      </w:r>
-      <w:proofErr w:type="spellEnd"/>
-      <w:r>
-        <w:rPr>
-          <w:rFonts w:eastAsiaTheme="minorEastAsia"/>
-          <w:color w:val="153D63" w:themeColor="text2" w:themeTint="E6"/>
-        </w:rPr>
-        <w:t xml:space="preserve"> = j, </w:t>
+        <w:t xml:space="preserve">i = j, </w:t>
       </w:r>
       <m:oMath>
         <m:sSub>
@@ -5707,23 +5718,7 @@
           <w:rFonts w:eastAsiaTheme="minorEastAsia"/>
           <w:color w:val="153D63" w:themeColor="text2" w:themeTint="E6"/>
         </w:rPr>
-        <w:t xml:space="preserve">n all cases, </w:t>
-      </w:r>
-      <w:proofErr w:type="spellStart"/>
-      <w:r>
-        <w:rPr>
-          <w:rFonts w:eastAsiaTheme="minorEastAsia"/>
-          <w:color w:val="153D63" w:themeColor="text2" w:themeTint="E6"/>
-        </w:rPr>
-        <w:t>j≠I</w:t>
-      </w:r>
-      <w:proofErr w:type="spellEnd"/>
-      <w:r>
-        <w:rPr>
-          <w:rFonts w:eastAsiaTheme="minorEastAsia"/>
-          <w:color w:val="153D63" w:themeColor="text2" w:themeTint="E6"/>
-        </w:rPr>
-        <w:t xml:space="preserve">, </w:t>
+        <w:t xml:space="preserve">n all cases, j≠I, </w:t>
       </w:r>
       <m:oMath>
         <m:r>
@@ -8468,23 +8463,7 @@
           <w:rFonts w:eastAsiaTheme="minorEastAsia"/>
           <w:color w:val="153D63" w:themeColor="text2" w:themeTint="E6"/>
         </w:rPr>
-        <w:t xml:space="preserve">Therefore, the </w:t>
-      </w:r>
-      <w:proofErr w:type="spellStart"/>
-      <w:r>
-        <w:rPr>
-          <w:rFonts w:eastAsiaTheme="minorEastAsia"/>
-          <w:color w:val="153D63" w:themeColor="text2" w:themeTint="E6"/>
-        </w:rPr>
-        <w:t>Softmax</w:t>
-      </w:r>
-      <w:proofErr w:type="spellEnd"/>
-      <w:r>
-        <w:rPr>
-          <w:rFonts w:eastAsiaTheme="minorEastAsia"/>
-          <w:color w:val="153D63" w:themeColor="text2" w:themeTint="E6"/>
-        </w:rPr>
-        <w:t xml:space="preserve"> will always choose the value with highest probability, just like argmax.</w:t>
+        <w:t>Therefore, the Softmax will always choose the value with highest probability, just like argmax.</w:t>
       </w:r>
     </w:p>
     <w:p/>
@@ -9142,7 +9121,6 @@
         </w:rPr>
         <w:t xml:space="preserve"> , which means each </w:t>
       </w:r>
-      <w:proofErr w:type="spellStart"/>
       <w:r>
         <w:rPr>
           <w:rFonts w:eastAsiaTheme="minorEastAsia"/>
@@ -9150,7 +9128,6 @@
         </w:rPr>
         <w:t>i</w:t>
       </w:r>
-      <w:proofErr w:type="spellEnd"/>
       <w:r>
         <w:rPr>
           <w:rFonts w:eastAsiaTheme="minorEastAsia"/>
@@ -9175,15 +9152,7 @@
         <w:pStyle w:val="FirstParagraph"/>
       </w:pPr>
       <w:r>
-        <w:t xml:space="preserve">As you know, </w:t>
-      </w:r>
-      <w:proofErr w:type="gramStart"/>
-      <w:r>
-        <w:t>When</w:t>
-      </w:r>
-      <w:proofErr w:type="gramEnd"/>
-      <w:r>
-        <w:t xml:space="preserve"> neural networks become very deep (i.e. have many layers), they become difficult to train due to the vanishing gradient problem – as the gradient is back-propagated through many layers, repeated multiplication can make the gradient extremely small, so that performance plateaus or even degrades. An effective approach is to add skip connections that skip one or more layers. See the provided network.</w:t>
+        <w:t>As you know, When neural networks become very deep (i.e. have many layers), they become difficult to train due to the vanishing gradient problem – as the gradient is back-propagated through many layers, repeated multiplication can make the gradient extremely small, so that performance plateaus or even degrades. An effective approach is to add skip connections that skip one or more layers. See the provided network.</w:t>
       </w:r>
     </w:p>
     <w:p>
@@ -9245,15 +9214,7 @@
         </w:numPr>
       </w:pPr>
       <w:r>
-        <w:t xml:space="preserve">You have seen this in the quiz, but </w:t>
-      </w:r>
-      <w:proofErr w:type="gramStart"/>
-      <w:r>
-        <w:t>lets</w:t>
-      </w:r>
-      <w:proofErr w:type="gramEnd"/>
-      <w:r>
-        <w:t xml:space="preserve"> try again. Prove that: </w:t>
+        <w:t xml:space="preserve">You have seen this in the quiz, but lets try again. Prove that: </w:t>
       </w:r>
       <m:oMath>
         <m:f>
@@ -9856,23 +9817,7 @@
           <w:rFonts w:eastAsiaTheme="minorEastAsia"/>
           <w:color w:val="153D63" w:themeColor="text2" w:themeTint="E6"/>
         </w:rPr>
-        <w:t xml:space="preserve">since </w:t>
-      </w:r>
-      <w:proofErr w:type="spellStart"/>
-      <w:r>
-        <w:rPr>
-          <w:rFonts w:eastAsiaTheme="minorEastAsia"/>
-          <w:color w:val="153D63" w:themeColor="text2" w:themeTint="E6"/>
-        </w:rPr>
-        <w:t>ReLU</w:t>
-      </w:r>
-      <w:proofErr w:type="spellEnd"/>
-      <w:r>
-        <w:rPr>
-          <w:rFonts w:eastAsiaTheme="minorEastAsia"/>
-          <w:color w:val="153D63" w:themeColor="text2" w:themeTint="E6"/>
-        </w:rPr>
-        <w:t xml:space="preserve"> is an elementwise operation, for input vector z = [</w:t>
+        <w:t>since ReLU is an elementwise operation, for input vector z = [</w:t>
       </w:r>
       <m:oMath>
         <m:sSub>
@@ -10572,23 +10517,7 @@
           <w:rFonts w:eastAsiaTheme="minorEastAsia"/>
           <w:color w:val="153D63" w:themeColor="text2" w:themeTint="E6"/>
         </w:rPr>
-        <w:t xml:space="preserve"> and for </w:t>
-      </w:r>
-      <w:proofErr w:type="spellStart"/>
-      <w:r>
-        <w:rPr>
-          <w:rFonts w:eastAsiaTheme="minorEastAsia"/>
-          <w:color w:val="153D63" w:themeColor="text2" w:themeTint="E6"/>
-        </w:rPr>
-        <w:t>i≠j</w:t>
-      </w:r>
-      <w:proofErr w:type="spellEnd"/>
-      <w:r>
-        <w:rPr>
-          <w:rFonts w:eastAsiaTheme="minorEastAsia"/>
-          <w:color w:val="153D63" w:themeColor="text2" w:themeTint="E6"/>
-        </w:rPr>
-        <w:t xml:space="preserve">.  </w:t>
+        <w:t xml:space="preserve"> and for i≠j.  </w:t>
       </w:r>
       <m:oMath>
         <m:f>
@@ -10901,26 +10830,8 @@
           <w:rFonts w:eastAsiaTheme="minorEastAsia"/>
           <w:color w:val="153D63" w:themeColor="text2" w:themeTint="E6"/>
         </w:rPr>
-        <w:t xml:space="preserve">) or </w:t>
-      </w:r>
-      <w:proofErr w:type="spellStart"/>
-      <w:proofErr w:type="gramStart"/>
-      <w:r>
-        <w:rPr>
-          <w:rFonts w:eastAsiaTheme="minorEastAsia"/>
-          <w:color w:val="153D63" w:themeColor="text2" w:themeTint="E6"/>
-        </w:rPr>
-        <w:t>ReLU</w:t>
-      </w:r>
-      <w:proofErr w:type="spellEnd"/>
-      <w:r>
-        <w:rPr>
-          <w:rFonts w:eastAsiaTheme="minorEastAsia"/>
-          <w:color w:val="153D63" w:themeColor="text2" w:themeTint="E6"/>
-        </w:rPr>
-        <w:t>(</w:t>
-      </w:r>
-      <w:proofErr w:type="gramEnd"/>
+        <w:t>) or ReLU(</w:t>
+      </w:r>
       <m:oMath>
         <m:sSub>
           <m:sSubPr>
@@ -11843,23 +11754,7 @@
           <w:rFonts w:eastAsiaTheme="minorEastAsia"/>
           <w:color w:val="153D63" w:themeColor="text2" w:themeTint="E6"/>
         </w:rPr>
-        <w:t xml:space="preserve"> and for </w:t>
-      </w:r>
-      <w:proofErr w:type="spellStart"/>
-      <w:r>
-        <w:rPr>
-          <w:rFonts w:eastAsiaTheme="minorEastAsia"/>
-          <w:color w:val="153D63" w:themeColor="text2" w:themeTint="E6"/>
-        </w:rPr>
-        <w:t>i≠j</w:t>
-      </w:r>
-      <w:proofErr w:type="spellEnd"/>
-      <w:r>
-        <w:rPr>
-          <w:rFonts w:eastAsiaTheme="minorEastAsia"/>
-          <w:color w:val="153D63" w:themeColor="text2" w:themeTint="E6"/>
-        </w:rPr>
-        <w:t xml:space="preserve">.  </w:t>
+        <w:t xml:space="preserve"> and for i≠j.  </w:t>
       </w:r>
       <m:oMath>
         <m:f>
@@ -14651,15 +14546,7 @@
         </w:numPr>
       </w:pPr>
       <w:r>
-        <w:t xml:space="preserve">In the given neural </w:t>
-      </w:r>
-      <w:proofErr w:type="gramStart"/>
-      <w:r>
-        <w:t>network</w:t>
-      </w:r>
-      <w:proofErr w:type="gramEnd"/>
-      <w:r>
-        <w:t xml:space="preserve"> your task is to </w:t>
+        <w:t xml:space="preserve">In the given neural network your task is to </w:t>
       </w:r>
       <w:r>
         <w:rPr>
@@ -17582,23 +17469,7 @@
           <w:rFonts w:eastAsiaTheme="minorEastAsia"/>
           <w:color w:val="153D63" w:themeColor="text2" w:themeTint="E6"/>
         </w:rPr>
-        <w:t xml:space="preserve">rewriting the two </w:t>
-      </w:r>
-      <w:proofErr w:type="spellStart"/>
-      <w:r>
-        <w:rPr>
-          <w:rFonts w:eastAsiaTheme="minorEastAsia"/>
-          <w:color w:val="153D63" w:themeColor="text2" w:themeTint="E6"/>
-        </w:rPr>
-        <w:t>ReLU</w:t>
-      </w:r>
-      <w:proofErr w:type="spellEnd"/>
-      <w:r>
-        <w:rPr>
-          <w:rFonts w:eastAsiaTheme="minorEastAsia"/>
-          <w:color w:val="153D63" w:themeColor="text2" w:themeTint="E6"/>
-        </w:rPr>
-        <w:t xml:space="preserve"> derivatives in terms of </w:t>
+        <w:t xml:space="preserve">rewriting the two ReLU derivatives in terms of </w:t>
       </w:r>
       <m:oMath>
         <m:sSub>
@@ -20028,15 +19899,7 @@
         <w:t>tokenization</w:t>
       </w:r>
       <w:r>
-        <w:t xml:space="preserve">. An </w:t>
-      </w:r>
-      <w:proofErr w:type="gramStart"/>
-      <w:r>
-        <w:t>often overlooked</w:t>
-      </w:r>
-      <w:proofErr w:type="gramEnd"/>
-      <w:r>
-        <w:t xml:space="preserve"> concept but it is a field of research in itself. Though we have SOTA algorithms for tokenization it’s always a good practice to understand the evolution trail.</w:t>
+        <w:t>. An often overlooked concept but it is a field of research in itself. Though we have SOTA algorithms for tokenization it’s always a good practice to understand the evolution trail.</w:t>
       </w:r>
       <w:r>
         <w:br/>
@@ -20215,23 +20078,7 @@
         <w:t>Missing words in the training data</w:t>
       </w:r>
       <w:r>
-        <w:t>: With word tokens, your model won’t recognize the variants of words that were not part of the data on which the model was trained. So, if your model has seen ‘</w:t>
-      </w:r>
-      <w:proofErr w:type="gramStart"/>
-      <w:r>
-        <w:t>foot‘ and</w:t>
-      </w:r>
-      <w:proofErr w:type="gramEnd"/>
-      <w:r>
-        <w:t xml:space="preserve"> ‘</w:t>
-      </w:r>
-      <w:proofErr w:type="gramStart"/>
-      <w:r>
-        <w:t>ball‘ in</w:t>
-      </w:r>
-      <w:proofErr w:type="gramEnd"/>
-      <w:r>
-        <w:t xml:space="preserve"> the training data but the final text has “football”, the model won’t be able to recognize the word and it will be treated with a “&lt;UNK&gt;” token. Similarly, punctuations pose another problem, “let” or “let’s” will need individual tokens and it is an inefficient solution. This will </w:t>
+        <w:t xml:space="preserve">: With word tokens, your model won’t recognize the variants of words that were not part of the data on which the model was trained. So, if your model has seen ‘foot‘ and ‘ball‘ in the training data but the final text has “football”, the model won’t be able to recognize the word and it will be treated with a “&lt;UNK&gt;” token. Similarly, punctuations pose another problem, “let” or “let’s” will need individual tokens and it is an inefficient solution. This will </w:t>
       </w:r>
       <w:r>
         <w:rPr>
@@ -20886,28 +20733,12 @@
         </w:rPr>
         <w:t xml:space="preserve">, </w:t>
       </w:r>
-      <w:proofErr w:type="spellStart"/>
-      <w:r>
-        <w:rPr>
-          <w:color w:val="153D63" w:themeColor="text2" w:themeTint="E6"/>
-        </w:rPr>
-        <w:t>ian</w:t>
-      </w:r>
-      <w:proofErr w:type="spellEnd"/>
-      <w:r>
-        <w:rPr>
-          <w:color w:val="153D63" w:themeColor="text2" w:themeTint="E6"/>
-        </w:rPr>
-        <w:t xml:space="preserve">&lt;/w&gt;, </w:t>
-      </w:r>
-      <w:proofErr w:type="spellStart"/>
-      <w:r>
-        <w:rPr>
-          <w:color w:val="153D63" w:themeColor="text2" w:themeTint="E6"/>
-        </w:rPr>
-        <w:t>attemp</w:t>
-      </w:r>
-      <w:proofErr w:type="spellEnd"/>
+      <w:r>
+        <w:rPr>
+          <w:color w:val="153D63" w:themeColor="text2" w:themeTint="E6"/>
+        </w:rPr>
+        <w:t>ian&lt;/w&gt;, attemp</w:t>
+      </w:r>
     </w:p>
     <w:p>
       <w:pPr>
@@ -20923,21 +20754,7 @@
         <w:rPr>
           <w:color w:val="153D63" w:themeColor="text2" w:themeTint="E6"/>
         </w:rPr>
-        <w:t xml:space="preserve">non-English </w:t>
-      </w:r>
-      <w:proofErr w:type="gramStart"/>
-      <w:r>
-        <w:rPr>
-          <w:color w:val="153D63" w:themeColor="text2" w:themeTint="E6"/>
-        </w:rPr>
-        <w:t>words(</w:t>
-      </w:r>
-      <w:proofErr w:type="gramEnd"/>
-      <w:r>
-        <w:rPr>
-          <w:color w:val="153D63" w:themeColor="text2" w:themeTint="E6"/>
-        </w:rPr>
-        <w:t>including other languages or common sequence special characters)</w:t>
+        <w:t>non-English words(including other languages or common sequence special characters)</w:t>
       </w:r>
     </w:p>
     <w:p>
@@ -20990,21 +20807,7 @@
         <w:rPr>
           <w:color w:val="153D63" w:themeColor="text2" w:themeTint="E6"/>
         </w:rPr>
-        <w:t xml:space="preserve">Explain why these </w:t>
-      </w:r>
-      <w:proofErr w:type="spellStart"/>
-      <w:r>
-        <w:rPr>
-          <w:color w:val="153D63" w:themeColor="text2" w:themeTint="E6"/>
-        </w:rPr>
-        <w:t>subwords</w:t>
-      </w:r>
-      <w:proofErr w:type="spellEnd"/>
-      <w:r>
-        <w:rPr>
-          <w:color w:val="153D63" w:themeColor="text2" w:themeTint="E6"/>
-        </w:rPr>
-        <w:t xml:space="preserve"> have come about. (no more than 10 sentences)</w:t>
+        <w:t>Explain why these subwords have come about. (no more than 10 sentences)</w:t>
       </w:r>
     </w:p>
     <w:p>
@@ -21066,21 +20869,7 @@
         <w:rPr>
           <w:color w:val="153D63" w:themeColor="text2" w:themeTint="E6"/>
         </w:rPr>
-        <w:t xml:space="preserve"> “</w:t>
-      </w:r>
-      <w:proofErr w:type="spellStart"/>
-      <w:r>
-        <w:rPr>
-          <w:color w:val="153D63" w:themeColor="text2" w:themeTint="E6"/>
-        </w:rPr>
-        <w:t>st</w:t>
-      </w:r>
-      <w:proofErr w:type="spellEnd"/>
-      <w:r>
-        <w:rPr>
-          <w:color w:val="153D63" w:themeColor="text2" w:themeTint="E6"/>
-        </w:rPr>
-        <w:t xml:space="preserve">&lt;w&gt;”. </w:t>
+        <w:t xml:space="preserve"> “st&lt;w&gt;”. </w:t>
       </w:r>
       <w:r>
         <w:rPr>
@@ -21418,16 +21207,26 @@
         <w:rPr>
           <w:color w:val="153D63" w:themeColor="text2" w:themeTint="E6"/>
         </w:rPr>
-        <w:t xml:space="preserve">”, and especially “before&lt;/w&gt;”), this </w:t>
-      </w:r>
-      <w:proofErr w:type="spellStart"/>
-      <w:r>
-        <w:rPr>
-          <w:color w:val="153D63" w:themeColor="text2" w:themeTint="E6"/>
-        </w:rPr>
-        <w:t>subword</w:t>
-      </w:r>
-      <w:proofErr w:type="spellEnd"/>
+        <w:t xml:space="preserve">”, and especially “before&lt;/w&gt;”), this subword </w:t>
+      </w:r>
+      <w:r>
+        <w:rPr>
+          <w:color w:val="153D63" w:themeColor="text2" w:themeTint="E6"/>
+        </w:rPr>
+        <w:t xml:space="preserve">(“fore&lt;w&gt;”) </w:t>
+      </w:r>
+      <w:r>
+        <w:rPr>
+          <w:color w:val="153D63" w:themeColor="text2" w:themeTint="E6"/>
+        </w:rPr>
+        <w:t>wa</w:t>
+      </w:r>
+      <w:r>
+        <w:rPr>
+          <w:color w:val="153D63" w:themeColor="text2" w:themeTint="E6"/>
+        </w:rPr>
+        <w:t>s quickly formed.</w:t>
+      </w:r>
       <w:r>
         <w:rPr>
           <w:color w:val="153D63" w:themeColor="text2" w:themeTint="E6"/>
@@ -21438,45 +21237,13 @@
         <w:rPr>
           <w:color w:val="153D63" w:themeColor="text2" w:themeTint="E6"/>
         </w:rPr>
-        <w:t xml:space="preserve">(“fore&lt;w&gt;”) </w:t>
-      </w:r>
-      <w:r>
-        <w:rPr>
-          <w:color w:val="153D63" w:themeColor="text2" w:themeTint="E6"/>
-        </w:rPr>
-        <w:t>wa</w:t>
-      </w:r>
-      <w:r>
-        <w:rPr>
-          <w:color w:val="153D63" w:themeColor="text2" w:themeTint="E6"/>
-        </w:rPr>
-        <w:t>s quickly formed.</w:t>
-      </w:r>
-      <w:r>
-        <w:rPr>
-          <w:color w:val="153D63" w:themeColor="text2" w:themeTint="E6"/>
-        </w:rPr>
-        <w:t xml:space="preserve"> </w:t>
-      </w:r>
-      <w:r>
-        <w:rPr>
-          <w:color w:val="153D63" w:themeColor="text2" w:themeTint="E6"/>
-        </w:rPr>
         <w:t>“</w:t>
       </w:r>
-      <w:proofErr w:type="spellStart"/>
-      <w:r>
-        <w:rPr>
-          <w:color w:val="153D63" w:themeColor="text2" w:themeTint="E6"/>
-        </w:rPr>
-        <w:t>ian</w:t>
-      </w:r>
-      <w:proofErr w:type="spellEnd"/>
-      <w:r>
-        <w:rPr>
-          <w:color w:val="153D63" w:themeColor="text2" w:themeTint="E6"/>
-        </w:rPr>
-        <w:t>&lt;/w&gt;</w:t>
+      <w:r>
+        <w:rPr>
+          <w:color w:val="153D63" w:themeColor="text2" w:themeTint="E6"/>
+        </w:rPr>
+        <w:t>ian&lt;/w&gt;</w:t>
       </w:r>
       <w:r>
         <w:rPr>
@@ -21574,19 +21341,11 @@
         </w:rPr>
         <w:t>I included “</w:t>
       </w:r>
-      <w:proofErr w:type="spellStart"/>
-      <w:r>
-        <w:rPr>
-          <w:color w:val="153D63" w:themeColor="text2" w:themeTint="E6"/>
-        </w:rPr>
-        <w:t>attemp</w:t>
-      </w:r>
-      <w:proofErr w:type="spellEnd"/>
-      <w:r>
-        <w:rPr>
-          <w:color w:val="153D63" w:themeColor="text2" w:themeTint="E6"/>
-        </w:rPr>
-        <w:t xml:space="preserve">,” </w:t>
+      <w:r>
+        <w:rPr>
+          <w:color w:val="153D63" w:themeColor="text2" w:themeTint="E6"/>
+        </w:rPr>
+        <w:t xml:space="preserve">attemp,” </w:t>
       </w:r>
       <w:r>
         <w:rPr>
@@ -21604,21 +21363,7 @@
         <w:rPr>
           <w:color w:val="153D63" w:themeColor="text2" w:themeTint="E6"/>
         </w:rPr>
-        <w:t xml:space="preserve">a </w:t>
-      </w:r>
-      <w:proofErr w:type="spellStart"/>
-      <w:r>
-        <w:rPr>
-          <w:color w:val="153D63" w:themeColor="text2" w:themeTint="E6"/>
-        </w:rPr>
-        <w:t>subword</w:t>
-      </w:r>
-      <w:proofErr w:type="spellEnd"/>
-      <w:r>
-        <w:rPr>
-          <w:color w:val="153D63" w:themeColor="text2" w:themeTint="E6"/>
-        </w:rPr>
-        <w:t xml:space="preserve"> </w:t>
+        <w:t xml:space="preserve">a subword </w:t>
       </w:r>
       <w:r>
         <w:rPr>
@@ -21997,49 +21742,7 @@
         <w:rPr>
           <w:color w:val="153D63" w:themeColor="text2" w:themeTint="E6"/>
         </w:rPr>
-        <w:t>during the formation of “which&lt;w&gt;.” Since there is no “</w:t>
-      </w:r>
-      <w:proofErr w:type="spellStart"/>
-      <w:r>
-        <w:rPr>
-          <w:color w:val="153D63" w:themeColor="text2" w:themeTint="E6"/>
-        </w:rPr>
-        <w:t>hich</w:t>
-      </w:r>
-      <w:proofErr w:type="spellEnd"/>
-      <w:r>
-        <w:rPr>
-          <w:color w:val="153D63" w:themeColor="text2" w:themeTint="E6"/>
-        </w:rPr>
-        <w:t xml:space="preserve">&lt;w&gt;,” the </w:t>
-      </w:r>
-      <w:proofErr w:type="spellStart"/>
-      <w:r>
-        <w:rPr>
-          <w:color w:val="153D63" w:themeColor="text2" w:themeTint="E6"/>
-        </w:rPr>
-        <w:t>subwords</w:t>
-      </w:r>
-      <w:proofErr w:type="spellEnd"/>
-      <w:r>
-        <w:rPr>
-          <w:color w:val="153D63" w:themeColor="text2" w:themeTint="E6"/>
-        </w:rPr>
-        <w:t xml:space="preserve"> “</w:t>
-      </w:r>
-      <w:proofErr w:type="spellStart"/>
-      <w:r>
-        <w:rPr>
-          <w:color w:val="153D63" w:themeColor="text2" w:themeTint="E6"/>
-        </w:rPr>
-        <w:t>wh</w:t>
-      </w:r>
-      <w:proofErr w:type="spellEnd"/>
-      <w:r>
-        <w:rPr>
-          <w:color w:val="153D63" w:themeColor="text2" w:themeTint="E6"/>
-        </w:rPr>
-        <w:t>” and “ich&lt;w</w:t>
+        <w:t>during the formation of “which&lt;w&gt;.” Since there is no “hich&lt;w&gt;,” the subwords “wh” and “ich&lt;w</w:t>
       </w:r>
       <w:r>
         <w:rPr>
@@ -22086,13 +21789,8 @@
       </w:pPr>
       <w:bookmarkStart w:id="17" w:name="X5b5ddef1865ad7c7c9b32f9b2b826da1f5e7a98"/>
       <w:bookmarkEnd w:id="16"/>
-      <w:proofErr w:type="spellStart"/>
-      <w:r>
-        <w:t>Additonal</w:t>
-      </w:r>
-      <w:proofErr w:type="spellEnd"/>
-      <w:r>
-        <w:t xml:space="preserve"> Readings: Other Tokenization Algorithms</w:t>
+      <w:r>
+        <w:t>Additonal Readings: Other Tokenization Algorithms</w:t>
       </w:r>
     </w:p>
     <w:p>
@@ -22143,28 +21841,15 @@
         </w:r>
       </w:hyperlink>
       <w:r>
-        <w:t xml:space="preserve">. The algorithm was outlined </w:t>
-      </w:r>
-      <w:proofErr w:type="gramStart"/>
-      <w:r>
-        <w:t>in  and</w:t>
-      </w:r>
-      <w:proofErr w:type="gramEnd"/>
-      <w:r>
-        <w:t xml:space="preserve"> is very similar to BPE. WordPiece first initializes the vocabulary to include every character present in the training data and progressively learns a given number of merge rules. In contrast to BPE, WordPiece does not choose the most frequent symbol pair, but the one that maximizes the likelihood of the training data once added to the vocabulary.</w:t>
+        <w:t>. The algorithm was outlined in  and is very similar to BPE. WordPiece first initializes the vocabulary to include every character present in the training data and progressively learns a given number of merge rules. In contrast to BPE, WordPiece does not choose the most frequent symbol pair, but the one that maximizes the likelihood of the training data once added to the vocabulary.</w:t>
       </w:r>
     </w:p>
     <w:p>
       <w:pPr>
         <w:pStyle w:val="BodyText"/>
       </w:pPr>
-      <w:proofErr w:type="gramStart"/>
-      <w:r>
-        <w:t>So</w:t>
-      </w:r>
-      <w:proofErr w:type="gramEnd"/>
-      <w:r>
-        <w:t xml:space="preserve"> what does this mean exactly? Referring to the previous example, maximizing the likelihood of the training data is equivalent to finding the symbol pair, whose probability is divided by the probabilities of its first symbol followed by its second symbol is the greatest among all symbol pairs. E.g. “u”, followed by “g” would have only been merged if the probability of “ug” divided by “u”, “g” would have been greater than for any other symbol pair. Intuitively, WordPiece is slightly different from BPE in that it evaluates what it </w:t>
+      <w:r>
+        <w:t xml:space="preserve">So what does this mean exactly? Referring to the previous example, maximizing the likelihood of the training data is equivalent to finding the symbol pair, whose probability is divided by the probabilities of its first symbol followed by its second symbol is the greatest among all symbol pairs. E.g. “u”, followed by “g” would have only been merged if the probability of “ug” divided by “u”, “g” would have been greater than for any other symbol pair. Intuitively, WordPiece is slightly different from BPE in that it evaluates what it </w:t>
       </w:r>
       <w:r>
         <w:rPr>
@@ -22203,36 +21888,14 @@
       </w:pPr>
       <w:r>
         <w:br/>
-        <w:t xml:space="preserve">Unigram is a subword tokenization algorithm introduced </w:t>
-      </w:r>
-      <w:proofErr w:type="gramStart"/>
-      <w:r>
-        <w:t>in .</w:t>
-      </w:r>
-      <w:proofErr w:type="gramEnd"/>
-      <w:r>
-        <w:t xml:space="preserve"> In contrast to BPE or WordPiece, Unigram initializes its base vocabulary to a large number of symbols and progressively trims down each symbol to obtain a smaller vocabulary. The base vocabulary could for instance correspond to all pre-tokenized words and the most common substrings. Unigram is not used directly for any of the models in the transformers, but it’s used in conjunction with SentencePiece(</w:t>
+        <w:t>Unigram is a subword tokenization algorithm introduced in . In contrast to BPE or WordPiece, Unigram initializes its base vocabulary to a large number of symbols and progressively trims down each symbol to obtain a smaller vocabulary. The base vocabulary could for instance correspond to all pre-tokenized words and the most common substrings. Unigram is not used directly for any of the models in the transformers, but it’s used in conjunction with SentencePiece(</w:t>
       </w:r>
       <w:hyperlink w:anchor="paragraph:sentetncepiece">
         <w:r>
           <w:rPr>
             <w:rStyle w:val="Hyperlink"/>
           </w:rPr>
-          <w:t>[</w:t>
-        </w:r>
-        <w:proofErr w:type="gramStart"/>
-        <w:r>
-          <w:rPr>
-            <w:rStyle w:val="Hyperlink"/>
-          </w:rPr>
-          <w:t>paragraph:sentetncepiece</w:t>
-        </w:r>
-        <w:proofErr w:type="gramEnd"/>
-        <w:r>
-          <w:rPr>
-            <w:rStyle w:val="Hyperlink"/>
-          </w:rPr>
-          <w:t>]</w:t>
+          <w:t>[paragraph:sentetncepiece]</w:t>
         </w:r>
       </w:hyperlink>
       <w:r>
@@ -22300,15 +21963,7 @@
         <w:t>[“h”, “u”, “g”, “s”]</w:t>
       </w:r>
       <w:r>
-        <w:t xml:space="preserve">. </w:t>
-      </w:r>
-      <w:proofErr w:type="gramStart"/>
-      <w:r>
-        <w:t>So</w:t>
-      </w:r>
-      <w:proofErr w:type="gramEnd"/>
-      <w:r>
-        <w:t xml:space="preserve"> which one to choose? Unigram saves the probability of each token in the training corpus on top of saving the vocabulary so that the probability of each possible tokenization can be computed after training. The algorithm simply picks the most likely tokenization in practice but also offers the possibility to sample a possible tokenization according to their probabilities.</w:t>
+        <w:t>. So which one to choose? Unigram saves the probability of each token in the training corpus on top of saving the vocabulary so that the probability of each possible tokenization can be computed after training. The algorithm simply picks the most likely tokenization in practice but also offers the possibility to sample a possible tokenization according to their probabilities.</w:t>
       </w:r>
     </w:p>
     <w:p>
@@ -22681,15 +22336,7 @@
         </w:r>
       </w:hyperlink>
       <w:r>
-        <w:t xml:space="preserve"> uses a specific Chinese, Japanese, and Thai pre-tokenizer). To solve this problem more </w:t>
-      </w:r>
-      <w:proofErr w:type="gramStart"/>
-      <w:r>
-        <w:t>generally,  treats</w:t>
-      </w:r>
-      <w:proofErr w:type="gramEnd"/>
-      <w:r>
-        <w:t xml:space="preserve"> the input as a raw input stream, thus including the space in the set of characters to use. It then uses the BPE or unigram algorithm to construct the appropriate vocabulary.</w:t>
+        <w:t xml:space="preserve"> uses a specific Chinese, Japanese, and Thai pre-tokenizer). To solve this problem more generally,  treats the input as a raw input stream, thus including the space in the set of characters to use. It then uses the BPE or unigram algorithm to construct the appropriate vocabulary.</w:t>
       </w:r>
     </w:p>
     <w:p>
@@ -22780,15 +22427,7 @@
         <w:pStyle w:val="FirstParagraph"/>
       </w:pPr>
       <w:r>
-        <w:t xml:space="preserve">In the second part of the homework, we will build, train, and evaluate fixed-window MLP language models as we learned in class: given the context words in the fixed-size window on the </w:t>
-      </w:r>
-      <w:proofErr w:type="gramStart"/>
-      <w:r>
-        <w:t>left hand</w:t>
-      </w:r>
-      <w:proofErr w:type="gramEnd"/>
-      <w:r>
-        <w:t xml:space="preserve"> side, predict the next word continuation.</w:t>
+        <w:t>In the second part of the homework, we will build, train, and evaluate fixed-window MLP language models as we learned in class: given the context words in the fixed-size window on the left hand side, predict the next word continuation.</w:t>
       </w:r>
     </w:p>
     <w:p>
@@ -22938,21 +22577,8 @@
         <w:pStyle w:val="FirstParagraph"/>
       </w:pPr>
       <w:r>
-        <w:t>Let’s now turn to building our model. Here, we are following the footsteps of the neural probabilistic language model (NPLM</w:t>
-      </w:r>
-      <w:proofErr w:type="gramStart"/>
-      <w:r>
-        <w:t>) ,</w:t>
-      </w:r>
-      <w:proofErr w:type="gramEnd"/>
-      <w:r>
-        <w:t xml:space="preserve"> which is extending earlier studies such </w:t>
-      </w:r>
-      <w:proofErr w:type="gramStart"/>
-      <w:r>
-        <w:t>as .</w:t>
-      </w:r>
-      <w:proofErr w:type="gramEnd"/>
+        <w:t>Let’s now turn to building our model. Here, we are following the footsteps of the neural probabilistic language model (NPLM) , which is extending earlier studies such as .</w:t>
+      </w:r>
     </w:p>
     <w:p>
       <w:pPr>
@@ -23122,7 +22748,6 @@
           <w:numId w:val="20"/>
         </w:numPr>
       </w:pPr>
-      <w:proofErr w:type="spellStart"/>
       <w:r>
         <w:rPr>
           <w:rStyle w:val="VerbatimChar"/>
@@ -23130,7 +22755,6 @@
         <w:lastRenderedPageBreak/>
         <w:t>NPLM_first_block</w:t>
       </w:r>
-      <w:proofErr w:type="spellEnd"/>
       <w:r>
         <w:t xml:space="preserve">: input layer that embeds the input token ids into embedding vectors, concatenates the embeddings, applies linear transformation, layer normalization, and </w:t>
       </w:r>
@@ -23145,14 +22769,12 @@
           <w:numId w:val="17"/>
         </w:numPr>
       </w:pPr>
-      <w:proofErr w:type="spellStart"/>
       <w:r>
         <w:rPr>
           <w:rStyle w:val="VerbatimChar"/>
         </w:rPr>
         <w:t>NPLM_block</w:t>
       </w:r>
-      <w:proofErr w:type="spellEnd"/>
       <w:r>
         <w:t>: middle layers with linear transformation, tanh activation, residual connection, layer normalization, and dropout.</w:t>
       </w:r>
@@ -23233,14 +22855,12 @@
         <w:t xml:space="preserve"> for more details on these layers and operations. For embedding concatenation, you may find </w:t>
       </w:r>
       <w:hyperlink r:id="rId32">
-        <w:proofErr w:type="gramStart"/>
         <w:r>
           <w:rPr>
             <w:rStyle w:val="Hyperlink"/>
           </w:rPr>
           <w:t>torch.Tensor.view</w:t>
         </w:r>
-        <w:proofErr w:type="gramEnd"/>
       </w:hyperlink>
       <w:r>
         <w:t xml:space="preserve"> useful. Also, follow the step-by-step comments in the code for the requirements of the implementation.</w:t>
@@ -24185,13 +23805,8 @@
           <w:numId w:val="18"/>
         </w:numPr>
       </w:pPr>
-      <w:proofErr w:type="gramStart"/>
-      <w:r>
-        <w:t>First</w:t>
-      </w:r>
-      <w:proofErr w:type="gramEnd"/>
-      <w:r>
-        <w:t xml:space="preserve"> we will need to create a new model (with potentially random weights).</w:t>
+      <w:r>
+        <w:t>First we will need to create a new model (with potentially random weights).</w:t>
       </w:r>
     </w:p>
     <w:p>
@@ -24222,15 +23837,7 @@
       </w:pPr>
       <w:r>
         <w:lastRenderedPageBreak/>
-        <w:t xml:space="preserve">We then evaluate the loaded model on the dev set. Now that we have loaded a pre-trained LM, how can we sample from it? We will implement two strategies, greedy decoding and top-p </w:t>
-      </w:r>
-      <w:proofErr w:type="gramStart"/>
-      <w:r>
-        <w:t>sampling  that</w:t>
-      </w:r>
-      <w:proofErr w:type="gramEnd"/>
-      <w:r>
-        <w:t xml:space="preserve"> we briefly discussed in homework 2.</w:t>
+        <w:t>We then evaluate the loaded model on the dev set. Now that we have loaded a pre-trained LM, how can we sample from it? We will implement two strategies, greedy decoding and top-p sampling  that we briefly discussed in homework 2.</w:t>
       </w:r>
     </w:p>
     <w:p>
@@ -24668,21 +24275,7 @@
         <w:rPr>
           <w:color w:val="153D63" w:themeColor="text2" w:themeTint="E6"/>
         </w:rPr>
-        <w:t xml:space="preserve">Generated text: The best perks of living on the east stuff with a. 95. and steamed – 28 </w:t>
-      </w:r>
-      <w:proofErr w:type="spellStart"/>
-      <w:r>
-        <w:rPr>
-          <w:color w:val="153D63" w:themeColor="text2" w:themeTint="E6"/>
-        </w:rPr>
-        <w:t>Ediar</w:t>
-      </w:r>
-      <w:proofErr w:type="spellEnd"/>
-      <w:r>
-        <w:rPr>
-          <w:color w:val="153D63" w:themeColor="text2" w:themeTint="E6"/>
-        </w:rPr>
-        <w:t>, the TV lost he had made the film, and Frank cancel had a dress first</w:t>
+        <w:t>Generated text: The best perks of living on the east stuff with a. 95. and steamed – 28 Ediar, the TV lost he had made the film, and Frank cancel had a dress first</w:t>
       </w:r>
     </w:p>
     <w:p>
@@ -24774,16 +24367,8 @@
         <w:rPr>
           <w:color w:val="153D63" w:themeColor="text2" w:themeTint="E6"/>
         </w:rPr>
-        <w:t xml:space="preserve">that the generation does not terminate until the </w:t>
-      </w:r>
-      <w:proofErr w:type="spellStart"/>
-      <w:r>
-        <w:rPr>
-          <w:color w:val="153D63" w:themeColor="text2" w:themeTint="E6"/>
-        </w:rPr>
-        <w:t>max_len</w:t>
-      </w:r>
-      <w:proofErr w:type="spellEnd"/>
+        <w:t>that the generation does not terminate until the max_len</w:t>
+      </w:r>
       <w:r>
         <w:rPr>
           <w:color w:val="153D63" w:themeColor="text2" w:themeTint="E6"/>
@@ -27212,6 +26797,31 @@
 </file>
 
 <file path=customXml/item1.xml><?xml version="1.0" encoding="utf-8"?>
+<b:Sources xmlns:b="http://schemas.openxmlformats.org/officeDocument/2006/bibliography" xmlns="http://schemas.openxmlformats.org/officeDocument/2006/bibliography" SelectedStyle="\APASixthEditionOfficeOnline.xsl" StyleName="APA" Version="6"/>
+</file>
+
+<file path=customXml/item2.xml><?xml version="1.0" encoding="utf-8"?>
+<?mso-contentType ?>
+<FormTemplates xmlns="http://schemas.microsoft.com/sharepoint/v3/contenttype/forms">
+  <Display>DocumentLibraryForm</Display>
+  <Edit>DocumentLibraryForm</Edit>
+  <New>DocumentLibraryForm</New>
+</FormTemplates>
+</file>
+
+<file path=customXml/item3.xml><?xml version="1.0" encoding="utf-8"?>
+<p:properties xmlns:p="http://schemas.microsoft.com/office/2006/metadata/properties" xmlns:xsi="http://www.w3.org/2001/XMLSchema-instance" xmlns:pc="http://schemas.microsoft.com/office/infopath/2007/PartnerControls">
+  <documentManagement>
+    <Tag xmlns="e3b5c32c-df6c-443f-b08b-73d85d62f2b5" xsi:nil="true"/>
+    <lcf76f155ced4ddcb4097134ff3c332f xmlns="e3b5c32c-df6c-443f-b08b-73d85d62f2b5">
+      <Terms xmlns="http://schemas.microsoft.com/office/infopath/2007/PartnerControls"/>
+    </lcf76f155ced4ddcb4097134ff3c332f>
+    <TaxCatchAll xmlns="168931df-3f45-4445-be76-105235143e52" xsi:nil="true"/>
+  </documentManagement>
+</p:properties>
+</file>
+
+<file path=customXml/item4.xml><?xml version="1.0" encoding="utf-8"?>
 <ct:contentTypeSchema xmlns:ct="http://schemas.microsoft.com/office/2006/metadata/contentType" xmlns:ma="http://schemas.microsoft.com/office/2006/metadata/properties/metaAttributes" ct:_="" ma:_="" ma:contentTypeName="Document" ma:contentTypeID="0x010100681B81209776AF40B8AAD3C366C78D42" ma:contentTypeVersion="19" ma:contentTypeDescription="Create a new document." ma:contentTypeScope="" ma:versionID="fbb3406e25de908b5a868738d5cb1834">
   <xsd:schema xmlns:xsd="http://www.w3.org/2001/XMLSchema" xmlns:xs="http://www.w3.org/2001/XMLSchema" xmlns:p="http://schemas.microsoft.com/office/2006/metadata/properties" xmlns:ns2="e3b5c32c-df6c-443f-b08b-73d85d62f2b5" xmlns:ns3="168931df-3f45-4445-be76-105235143e52" targetNamespace="http://schemas.microsoft.com/office/2006/metadata/properties" ma:root="true" ma:fieldsID="a51a2fd210533027d0c682d7a8bd76c2" ns2:_="" ns3:_="">
     <xsd:import namespace="e3b5c32c-df6c-443f-b08b-73d85d62f2b5"/>
@@ -27474,32 +27084,34 @@
 </ct:contentTypeSchema>
 </file>
 
-<file path=customXml/item2.xml><?xml version="1.0" encoding="utf-8"?>
-<p:properties xmlns:p="http://schemas.microsoft.com/office/2006/metadata/properties" xmlns:xsi="http://www.w3.org/2001/XMLSchema-instance" xmlns:pc="http://schemas.microsoft.com/office/infopath/2007/PartnerControls">
-  <documentManagement>
-    <Tag xmlns="e3b5c32c-df6c-443f-b08b-73d85d62f2b5" xsi:nil="true"/>
-    <lcf76f155ced4ddcb4097134ff3c332f xmlns="e3b5c32c-df6c-443f-b08b-73d85d62f2b5">
-      <Terms xmlns="http://schemas.microsoft.com/office/infopath/2007/PartnerControls"/>
-    </lcf76f155ced4ddcb4097134ff3c332f>
-    <TaxCatchAll xmlns="168931df-3f45-4445-be76-105235143e52" xsi:nil="true"/>
-  </documentManagement>
-</p:properties>
+<file path=customXml/itemProps1.xml><?xml version="1.0" encoding="utf-8"?>
+<ds:datastoreItem xmlns:ds="http://schemas.openxmlformats.org/officeDocument/2006/customXml" ds:itemID="{749C376C-2CB0-44C3-9D7E-A8E580522F06}">
+  <ds:schemaRefs>
+    <ds:schemaRef ds:uri="http://schemas.openxmlformats.org/officeDocument/2006/bibliography"/>
+  </ds:schemaRefs>
+</ds:datastoreItem>
 </file>
 
-<file path=customXml/item3.xml><?xml version="1.0" encoding="utf-8"?>
-<?mso-contentType ?>
-<FormTemplates xmlns="http://schemas.microsoft.com/sharepoint/v3/contenttype/forms">
-  <Display>DocumentLibraryForm</Display>
-  <Edit>DocumentLibraryForm</Edit>
-  <New>DocumentLibraryForm</New>
-</FormTemplates>
+<file path=customXml/itemProps2.xml><?xml version="1.0" encoding="utf-8"?>
+<ds:datastoreItem xmlns:ds="http://schemas.openxmlformats.org/officeDocument/2006/customXml" ds:itemID="{E6FB9AC8-3CBA-4EF3-A169-567AAA3A0D64}">
+  <ds:schemaRefs>
+    <ds:schemaRef ds:uri="http://schemas.microsoft.com/sharepoint/v3/contenttype/forms"/>
+  </ds:schemaRefs>
+</ds:datastoreItem>
 </file>
 
-<file path=customXml/item4.xml><?xml version="1.0" encoding="utf-8"?>
-<b:Sources xmlns:b="http://schemas.openxmlformats.org/officeDocument/2006/bibliography" xmlns="http://schemas.openxmlformats.org/officeDocument/2006/bibliography" SelectedStyle="\APASixthEditionOfficeOnline.xsl" StyleName="APA" Version="6"/>
+<file path=customXml/itemProps3.xml><?xml version="1.0" encoding="utf-8"?>
+<ds:datastoreItem xmlns:ds="http://schemas.openxmlformats.org/officeDocument/2006/customXml" ds:itemID="{7B9130B4-47BC-48E5-9AA3-3355EF660859}">
+  <ds:schemaRefs>
+    <ds:schemaRef ds:uri="http://schemas.microsoft.com/office/2006/metadata/properties"/>
+    <ds:schemaRef ds:uri="http://schemas.microsoft.com/office/infopath/2007/PartnerControls"/>
+    <ds:schemaRef ds:uri="e3b5c32c-df6c-443f-b08b-73d85d62f2b5"/>
+    <ds:schemaRef ds:uri="168931df-3f45-4445-be76-105235143e52"/>
+  </ds:schemaRefs>
+</ds:datastoreItem>
 </file>
 
-<file path=customXml/itemProps1.xml><?xml version="1.0" encoding="utf-8"?>
+<file path=customXml/itemProps4.xml><?xml version="1.0" encoding="utf-8"?>
 <ds:datastoreItem xmlns:ds="http://schemas.openxmlformats.org/officeDocument/2006/customXml" ds:itemID="{07CBC8A3-6709-4FA3-AAD4-0841E77CA241}">
   <ds:schemaRefs>
     <ds:schemaRef ds:uri="http://schemas.microsoft.com/office/2006/metadata/contentType"/>
@@ -27516,31 +27128,4 @@
     <ds:schemaRef ds:uri="http://schemas.microsoft.com/internal/obd"/>
   </ds:schemaRefs>
 </ds:datastoreItem>
-</file>
-
-<file path=customXml/itemProps2.xml><?xml version="1.0" encoding="utf-8"?>
-<ds:datastoreItem xmlns:ds="http://schemas.openxmlformats.org/officeDocument/2006/customXml" ds:itemID="{7B9130B4-47BC-48E5-9AA3-3355EF660859}">
-  <ds:schemaRefs>
-    <ds:schemaRef ds:uri="http://schemas.microsoft.com/office/2006/metadata/properties"/>
-    <ds:schemaRef ds:uri="http://schemas.microsoft.com/office/infopath/2007/PartnerControls"/>
-    <ds:schemaRef ds:uri="e3b5c32c-df6c-443f-b08b-73d85d62f2b5"/>
-    <ds:schemaRef ds:uri="168931df-3f45-4445-be76-105235143e52"/>
-  </ds:schemaRefs>
-</ds:datastoreItem>
-</file>
-
-<file path=customXml/itemProps3.xml><?xml version="1.0" encoding="utf-8"?>
-<ds:datastoreItem xmlns:ds="http://schemas.openxmlformats.org/officeDocument/2006/customXml" ds:itemID="{E6FB9AC8-3CBA-4EF3-A169-567AAA3A0D64}">
-  <ds:schemaRefs>
-    <ds:schemaRef ds:uri="http://schemas.microsoft.com/sharepoint/v3/contenttype/forms"/>
-  </ds:schemaRefs>
-</ds:datastoreItem>
-</file>
-
-<file path=customXml/itemProps4.xml><?xml version="1.0" encoding="utf-8"?>
-<ds:datastoreItem xmlns:ds="http://schemas.openxmlformats.org/officeDocument/2006/customXml" ds:itemID="{749C376C-2CB0-44C3-9D7E-A8E580522F06}">
-  <ds:schemaRefs>
-    <ds:schemaRef ds:uri="http://schemas.openxmlformats.org/officeDocument/2006/bibliography"/>
-  </ds:schemaRefs>
-</ds:datastoreItem>
 </file>
</xml_diff>